<commit_message>
docs(shop): CHIEF is a pluggable layer (HELIX-CRM default / bring-your-own-CRM)
Clarify §5 + P1-BUILD: agents talk to the CHIEF layer, not a specific CRM.
SharedMemory (HELIX) separated from CrmProvider (customer's CRM possible).

Co-Authored-By: Claude Opus 4.8 (1M context) <noreply@anthropic.com>
</commit_message>
<xml_diff>
--- a/PRODUCTS/12-helix-shop-P1-BUILD.docx
+++ b/PRODUCTS/12-helix-shop-P1-BUILD.docx
@@ -2333,7 +2333,13 @@
               <w:rPr>
                 <w:rStyle w:val="VerbatimChar"/>
               </w:rPr>
-              <w:t xml:space="preserve">lib/chief/bridge.ts</w:t>
+              <w:t xml:space="preserve">@helix/chief</w:t>
+            </w:r>
+            <w:r>
+              <w:t xml:space="preserve"> </w:t>
+            </w:r>
+            <w:r>
+              <w:t xml:space="preserve">(חבילה)</w:t>
             </w:r>
           </w:p>
         </w:tc>
@@ -2348,13 +2354,90 @@
                 <w:b/>
                 <w:bCs/>
               </w:rPr>
+              <w:t xml:space="preserve">מעודכן</w:t>
+            </w:r>
+            <w:r>
+              <w:t xml:space="preserve"> </w:t>
+            </w:r>
+            <w:r>
+              <w:t xml:space="preserve">— הפרדה:</w:t>
+            </w:r>
+            <w:r>
+              <w:t xml:space="preserve"> </w:t>
+            </w:r>
+            <w:r>
+              <w:rPr>
+                <w:rStyle w:val="VerbatimChar"/>
+              </w:rPr>
+              <w:t xml:space="preserve">SharedMemory</w:t>
+            </w:r>
+            <w:r>
+              <w:t xml:space="preserve"> </w:t>
+            </w:r>
+            <w:r>
+              <w:t xml:space="preserve">(state אצל HELIX)</w:t>
+            </w:r>
+            <w:r>
+              <w:t xml:space="preserve"> </w:t>
+            </w:r>
+            <w:r>
+              <w:rPr>
+                <w:b/>
+                <w:bCs/>
+              </w:rPr>
+              <w:t xml:space="preserve">נפרד מ</w:t>
+            </w:r>
+            <w:r>
+              <w:t xml:space="preserve">-</w:t>
+            </w:r>
+            <w:r>
+              <w:rPr>
+                <w:rStyle w:val="VerbatimChar"/>
+              </w:rPr>
+              <w:t xml:space="preserve">CrmProvider</w:t>
+            </w:r>
+            <w:r>
+              <w:t xml:space="preserve"> </w:t>
+            </w:r>
+            <w:r>
+              <w:t xml:space="preserve">pluggable (HELIX-CRM default / HubSpot/Salesforce של הלקוח). SHOP מדבר עם השכבה, לא עם CRM ספציפי</w:t>
+            </w:r>
+          </w:p>
+        </w:tc>
+      </w:tr>
+      <w:tr>
+        <w:tc>
+          <w:tcPr/>
+          <w:p>
+            <w:pPr>
+              <w:pStyle w:val="Compact"/>
+            </w:pPr>
+            <w:r>
+              <w:rPr>
+                <w:rStyle w:val="VerbatimChar"/>
+              </w:rPr>
+              <w:t xml:space="preserve">apps/shop/lib/chief/*.ts</w:t>
+            </w:r>
+          </w:p>
+        </w:tc>
+        <w:tc>
+          <w:tcPr/>
+          <w:p>
+            <w:pPr>
+              <w:pStyle w:val="Compact"/>
+            </w:pPr>
+            <w:r>
+              <w:rPr>
+                <w:b/>
+                <w:bCs/>
+              </w:rPr>
               <w:t xml:space="preserve">חדש</w:t>
             </w:r>
             <w:r>
               <w:t xml:space="preserve"> </w:t>
             </w:r>
             <w:r>
-              <w:t xml:space="preserve">— שיחה →</w:t>
+              <w:t xml:space="preserve">— מימוש</w:t>
             </w:r>
             <w:r>
               <w:t xml:space="preserve"> </w:t>
@@ -2363,30 +2446,28 @@
               <w:rPr>
                 <w:rStyle w:val="VerbatimChar"/>
               </w:rPr>
+              <w:t xml:space="preserve">HelixCrmProvider</w:t>
+            </w:r>
+            <w:r>
+              <w:t xml:space="preserve"> </w:t>
+            </w:r>
+            <w:r>
+              <w:t xml:space="preserve">default + mapping שיחה →</w:t>
+            </w:r>
+            <w:r>
+              <w:t xml:space="preserve"> </w:t>
+            </w:r>
+            <w:r>
+              <w:rPr>
+                <w:rStyle w:val="VerbatimChar"/>
+              </w:rPr>
               <w:t xml:space="preserve">shopper_conversation</w:t>
             </w:r>
             <w:r>
               <w:t xml:space="preserve"> </w:t>
             </w:r>
             <w:r>
-              <w:t xml:space="preserve">+ contact/deal ב-CRM (סכמת</w:t>
-            </w:r>
-            <w:r>
-              <w:t xml:space="preserve"> </w:t>
-            </w:r>
-            <w:hyperlink r:id="rId9">
-              <w:r>
-                <w:rPr>
-                  <w:rStyle w:val="Hyperlink"/>
-                </w:rPr>
-                <w:t xml:space="preserve">12-helix-shop.md</w:t>
-              </w:r>
-            </w:hyperlink>
-            <w:r>
-              <w:t xml:space="preserve"> </w:t>
-            </w:r>
-            <w:r>
-              <w:t xml:space="preserve">§5)</w:t>
+              <w:t xml:space="preserve">+ contact/deal (סכמת §5)</w:t>
             </w:r>
           </w:p>
         </w:tc>

</xml_diff>